<commit_message>
Add footnotes class to byrne articles css. Add Jonathan Raban. Reorganise Sally Rooney from Anne Enright.
</commit_message>
<xml_diff>
--- a/WIX migration to Aruba.docx
+++ b/WIX migration to Aruba.docx
@@ -53,6 +53,431 @@
       </w:r>
       <w:r>
         <w:rPr/>
+        <w:t>From ARUBA.IT</w:t>
+      </w:r>
+    </w:p>
+    <w:p>
+      <w:pPr>
+        <w:pStyle w:val="BodyText"/>
+        <w:bidi w:val="0"/>
+        <w:spacing w:before="200" w:after="120"/>
+        <w:jc w:val="start"/>
+        <w:rPr/>
+      </w:pPr>
+      <w:r>
+        <w:rPr>
+          <w:rStyle w:val="Strong"/>
+          <w:rFonts w:ascii="Lato;sans-serif" w:hAnsi="Lato;sans-serif"/>
+          <w:b w:val="false"/>
+          <w:i w:val="false"/>
+          <w:caps w:val="false"/>
+          <w:smallCaps w:val="false"/>
+          <w:color w:val="222222"/>
+          <w:spacing w:val="0"/>
+          <w:sz w:val="24"/>
+        </w:rPr>
+        <w:t xml:space="preserve">Control Panel: </w:t>
+      </w:r>
+      <w:hyperlink r:id="rId3">
+        <w:r>
+          <w:rPr>
+            <w:rStyle w:val="Hyperlink"/>
+            <w:rFonts w:ascii="Lato;sans-serif" w:hAnsi="Lato;sans-serif"/>
+            <w:b/>
+            <w:b w:val="false"/>
+            <w:bCs/>
+            <w:i w:val="false"/>
+            <w:caps w:val="false"/>
+            <w:smallCaps w:val="false"/>
+            <w:color w:val="222222"/>
+            <w:spacing w:val="0"/>
+            <w:sz w:val="24"/>
+          </w:rPr>
+          <w:t>https://admin.aruba.it/PannelloAdmin/Login.aspx</w:t>
+        </w:r>
+      </w:hyperlink>
+    </w:p>
+    <w:p>
+      <w:pPr>
+        <w:pStyle w:val="BodyText"/>
+        <w:bidi w:val="0"/>
+        <w:spacing w:before="200" w:after="120"/>
+        <w:jc w:val="start"/>
+        <w:rPr/>
+      </w:pPr>
+      <w:r>
+        <w:rPr>
+          <w:rStyle w:val="Strong"/>
+          <w:rFonts w:ascii="Lato;sans-serif" w:hAnsi="Lato;sans-serif"/>
+          <w:b w:val="false"/>
+          <w:i w:val="false"/>
+          <w:caps w:val="false"/>
+          <w:smallCaps w:val="false"/>
+          <w:color w:val="222222"/>
+          <w:spacing w:val="0"/>
+          <w:sz w:val="24"/>
+        </w:rPr>
+        <w:t>Manage your Domain</w:t>
+      </w:r>
+    </w:p>
+    <w:p>
+      <w:pPr>
+        <w:pStyle w:val="BodyText"/>
+        <w:widowControl/>
+        <w:pBdr/>
+        <w:spacing w:lineRule="atLeast" w:line="360" w:before="120" w:after="120"/>
+        <w:ind w:hanging="0" w:start="0" w:end="0"/>
+        <w:rPr>
+          <w:rFonts w:ascii="Lato;sans-serif" w:hAnsi="Lato;sans-serif"/>
+          <w:b w:val="false"/>
+          <w:i w:val="false"/>
+          <w:caps w:val="false"/>
+          <w:smallCaps w:val="false"/>
+          <w:color w:val="222222"/>
+          <w:spacing w:val="0"/>
+          <w:sz w:val="24"/>
+        </w:rPr>
+      </w:pPr>
+      <w:r>
+        <w:rPr>
+          <w:rFonts w:ascii="Lato;sans-serif" w:hAnsi="Lato;sans-serif"/>
+          <w:b w:val="false"/>
+          <w:i w:val="false"/>
+          <w:caps w:val="false"/>
+          <w:smallCaps w:val="false"/>
+          <w:color w:val="222222"/>
+          <w:spacing w:val="0"/>
+          <w:sz w:val="24"/>
+        </w:rPr>
+        <w:t>From the Domain section of the control panel, you can:</w:t>
+      </w:r>
+    </w:p>
+    <w:p>
+      <w:pPr>
+        <w:pStyle w:val="BodyText"/>
+        <w:widowControl/>
+        <w:numPr>
+          <w:ilvl w:val="0"/>
+          <w:numId w:val="24"/>
+        </w:numPr>
+        <w:tabs>
+          <w:tab w:val="clear" w:pos="709"/>
+          <w:tab w:val="left" w:pos="0" w:leader="none"/>
+        </w:tabs>
+        <w:spacing w:lineRule="atLeast" w:line="360" w:before="200" w:after="0"/>
+        <w:ind w:hanging="0" w:start="709" w:end="0"/>
+        <w:rPr/>
+      </w:pPr>
+      <w:r>
+        <w:rPr>
+          <w:rStyle w:val="Strong"/>
+          <w:rFonts w:ascii="Arial;sans-serif" w:hAnsi="Arial;sans-serif"/>
+          <w:b w:val="false"/>
+          <w:i w:val="false"/>
+          <w:caps w:val="false"/>
+          <w:smallCaps w:val="false"/>
+          <w:color w:val="222222"/>
+          <w:spacing w:val="0"/>
+          <w:sz w:val="24"/>
+        </w:rPr>
+        <w:t>Manage DNS and Name Servers</w:t>
+      </w:r>
+      <w:r>
+        <w:rPr>
+          <w:rFonts w:ascii="Arial;sans-serif" w:hAnsi="Arial;sans-serif"/>
+          <w:b w:val="false"/>
+          <w:i w:val="false"/>
+          <w:caps w:val="false"/>
+          <w:smallCaps w:val="false"/>
+          <w:color w:val="222222"/>
+          <w:spacing w:val="0"/>
+          <w:sz w:val="24"/>
+        </w:rPr>
+        <w:t>: choose whether to configure your DNS or use Aruba Name Servers. In the same section you can set up all the records for the area (A, MX, CNAME).</w:t>
+      </w:r>
+    </w:p>
+    <w:p>
+      <w:pPr>
+        <w:pStyle w:val="BodyText"/>
+        <w:widowControl/>
+        <w:numPr>
+          <w:ilvl w:val="0"/>
+          <w:numId w:val="24"/>
+        </w:numPr>
+        <w:tabs>
+          <w:tab w:val="clear" w:pos="709"/>
+          <w:tab w:val="left" w:pos="0" w:leader="none"/>
+        </w:tabs>
+        <w:spacing w:lineRule="atLeast" w:line="360" w:before="200" w:after="283"/>
+        <w:ind w:hanging="0" w:start="709" w:end="0"/>
+        <w:rPr/>
+      </w:pPr>
+      <w:r>
+        <w:rPr>
+          <w:rStyle w:val="Strong"/>
+          <w:rFonts w:ascii="Arial;sans-serif" w:hAnsi="Arial;sans-serif"/>
+          <w:b w:val="false"/>
+          <w:i w:val="false"/>
+          <w:caps w:val="false"/>
+          <w:smallCaps w:val="false"/>
+          <w:color w:val="222222"/>
+          <w:spacing w:val="0"/>
+          <w:sz w:val="24"/>
+        </w:rPr>
+        <w:t>Redirect</w:t>
+      </w:r>
+      <w:r>
+        <w:rPr>
+          <w:rFonts w:ascii="Arial;sans-serif" w:hAnsi="Arial;sans-serif"/>
+          <w:b w:val="false"/>
+          <w:i w:val="false"/>
+          <w:caps w:val="false"/>
+          <w:smallCaps w:val="false"/>
+          <w:color w:val="222222"/>
+          <w:spacing w:val="0"/>
+          <w:sz w:val="24"/>
+        </w:rPr>
+        <w:t>: set a URL for the redirect (or an IP address) and take your website visitors to an existing web page or another website.</w:t>
+      </w:r>
+    </w:p>
+    <w:p>
+      <w:pPr>
+        <w:pStyle w:val="BodyText"/>
+        <w:widowControl/>
+        <w:pBdr/>
+        <w:spacing w:lineRule="atLeast" w:line="360" w:before="120" w:after="120"/>
+        <w:ind w:hanging="0" w:start="0" w:end="0"/>
+        <w:rPr/>
+      </w:pPr>
+      <w:r>
+        <w:rPr>
+          <w:rFonts w:ascii="Lato;sans-serif" w:hAnsi="Lato;sans-serif"/>
+          <w:b w:val="false"/>
+          <w:i w:val="false"/>
+          <w:caps w:val="false"/>
+          <w:smallCaps w:val="false"/>
+          <w:color w:val="222222"/>
+          <w:spacing w:val="0"/>
+          <w:sz w:val="24"/>
+        </w:rPr>
+        <w:t>Do you have any questions on managing your service? See our </w:t>
+      </w:r>
+      <w:hyperlink r:id="rId4" w:tgtFrame="_blank">
+        <w:r>
+          <w:rPr>
+            <w:rStyle w:val="Hyperlink"/>
+            <w:rFonts w:ascii="Arial;sans-serif" w:hAnsi="Arial;sans-serif"/>
+            <w:b w:val="false"/>
+            <w:i w:val="false"/>
+            <w:caps w:val="false"/>
+            <w:smallCaps w:val="false"/>
+            <w:color w:val="1474BD"/>
+            <w:spacing w:val="0"/>
+            <w:sz w:val="24"/>
+            <w:u w:val="single"/>
+          </w:rPr>
+          <w:t>guides</w:t>
+        </w:r>
+      </w:hyperlink>
+      <w:r>
+        <w:rPr>
+          <w:rFonts w:ascii="Lato;sans-serif" w:hAnsi="Lato;sans-serif"/>
+          <w:b w:val="false"/>
+          <w:i w:val="false"/>
+          <w:caps w:val="false"/>
+          <w:smallCaps w:val="false"/>
+          <w:color w:val="222222"/>
+          <w:spacing w:val="0"/>
+          <w:sz w:val="24"/>
+        </w:rPr>
+        <w:t>.</w:t>
+      </w:r>
+    </w:p>
+    <w:p>
+      <w:pPr>
+        <w:pStyle w:val="BodyText"/>
+        <w:spacing w:before="200" w:after="120"/>
+        <w:ind w:hanging="0" w:start="0" w:end="0"/>
+        <w:rPr/>
+      </w:pPr>
+      <w:r>
+        <w:rPr/>
+      </w:r>
+    </w:p>
+    <w:p>
+      <w:pPr>
+        <w:pStyle w:val="BodyText"/>
+        <w:widowControl/>
+        <w:pBdr/>
+        <w:spacing w:lineRule="atLeast" w:line="420" w:before="120" w:after="120"/>
+        <w:ind w:hanging="0" w:start="0" w:end="0"/>
+        <w:rPr>
+          <w:rFonts w:ascii="Lato;sans-serif" w:hAnsi="Lato;sans-serif"/>
+          <w:b w:val="false"/>
+          <w:i w:val="false"/>
+          <w:caps w:val="false"/>
+          <w:smallCaps w:val="false"/>
+          <w:color w:val="222222"/>
+          <w:spacing w:val="0"/>
+          <w:sz w:val="36"/>
+        </w:rPr>
+      </w:pPr>
+      <w:r>
+        <w:rPr>
+          <w:rFonts w:ascii="Lato;sans-serif" w:hAnsi="Lato;sans-serif"/>
+          <w:b w:val="false"/>
+          <w:i w:val="false"/>
+          <w:caps w:val="false"/>
+          <w:smallCaps w:val="false"/>
+          <w:color w:val="222222"/>
+          <w:spacing w:val="0"/>
+          <w:sz w:val="36"/>
+        </w:rPr>
+        <w:t>Manage domain services</w:t>
+      </w:r>
+    </w:p>
+    <w:p>
+      <w:pPr>
+        <w:pStyle w:val="BodyText"/>
+        <w:widowControl/>
+        <w:pBdr/>
+        <w:spacing w:lineRule="atLeast" w:line="360" w:before="120" w:after="120"/>
+        <w:ind w:hanging="0" w:start="0" w:end="0"/>
+        <w:rPr/>
+      </w:pPr>
+      <w:r>
+        <w:rPr>
+          <w:rFonts w:ascii="Lato;sans-serif" w:hAnsi="Lato;sans-serif"/>
+          <w:b w:val="false"/>
+          <w:i w:val="false"/>
+          <w:caps w:val="false"/>
+          <w:smallCaps w:val="false"/>
+          <w:color w:val="222222"/>
+          <w:spacing w:val="0"/>
+          <w:sz w:val="24"/>
+        </w:rPr>
+        <w:t>We are in the process of activating the services listed below. These will be operational and ready to configure </w:t>
+      </w:r>
+      <w:r>
+        <w:rPr>
+          <w:rStyle w:val="Strong"/>
+          <w:rFonts w:ascii="Lato;sans-serif" w:hAnsi="Lato;sans-serif"/>
+          <w:b w:val="false"/>
+          <w:i w:val="false"/>
+          <w:caps w:val="false"/>
+          <w:smallCaps w:val="false"/>
+          <w:color w:val="222222"/>
+          <w:spacing w:val="0"/>
+          <w:sz w:val="24"/>
+        </w:rPr>
+        <w:t>within the next 24 hours</w:t>
+      </w:r>
+      <w:r>
+        <w:rPr>
+          <w:rFonts w:ascii="Lato;sans-serif" w:hAnsi="Lato;sans-serif"/>
+          <w:b w:val="false"/>
+          <w:i w:val="false"/>
+          <w:caps w:val="false"/>
+          <w:smallCaps w:val="false"/>
+          <w:color w:val="222222"/>
+          <w:spacing w:val="0"/>
+          <w:sz w:val="24"/>
+        </w:rPr>
+        <w:t>.</w:t>
+      </w:r>
+    </w:p>
+    <w:p>
+      <w:pPr>
+        <w:pStyle w:val="BodyText"/>
+        <w:spacing w:before="200" w:after="120"/>
+        <w:ind w:hanging="0" w:start="0" w:end="0"/>
+        <w:rPr/>
+      </w:pPr>
+      <w:r>
+        <w:rPr/>
+      </w:r>
+    </w:p>
+    <w:p>
+      <w:pPr>
+        <w:pStyle w:val="BodyText"/>
+        <w:widowControl/>
+        <w:pBdr/>
+        <w:spacing w:lineRule="atLeast" w:line="360" w:before="120" w:after="120"/>
+        <w:ind w:hanging="0" w:start="0" w:end="0"/>
+        <w:rPr/>
+      </w:pPr>
+      <w:r>
+        <w:rPr>
+          <w:rStyle w:val="Strong"/>
+          <w:rFonts w:ascii="Lato;sans-serif" w:hAnsi="Lato;sans-serif"/>
+          <w:b w:val="false"/>
+          <w:i w:val="false"/>
+          <w:caps w:val="false"/>
+          <w:smallCaps w:val="false"/>
+          <w:color w:val="222222"/>
+          <w:spacing w:val="0"/>
+          <w:sz w:val="24"/>
+        </w:rPr>
+        <w:t>Extra for you</w:t>
+      </w:r>
+    </w:p>
+    <w:p>
+      <w:pPr>
+        <w:pStyle w:val="BodyText"/>
+        <w:widowControl/>
+        <w:pBdr/>
+        <w:spacing w:lineRule="atLeast" w:line="360" w:before="120" w:after="120"/>
+        <w:ind w:hanging="0" w:start="0" w:end="0"/>
+        <w:rPr>
+          <w:rFonts w:ascii="Lato;sans-serif" w:hAnsi="Lato;sans-serif"/>
+          <w:b w:val="false"/>
+          <w:i w:val="false"/>
+          <w:caps w:val="false"/>
+          <w:smallCaps w:val="false"/>
+          <w:color w:val="222222"/>
+          <w:spacing w:val="0"/>
+          <w:sz w:val="24"/>
+        </w:rPr>
+      </w:pPr>
+      <w:r>
+        <w:rPr>
+          <w:rFonts w:ascii="Lato;sans-serif" w:hAnsi="Lato;sans-serif"/>
+          <w:b w:val="false"/>
+          <w:i w:val="false"/>
+          <w:caps w:val="false"/>
+          <w:smallCaps w:val="false"/>
+          <w:color w:val="222222"/>
+          <w:spacing w:val="0"/>
+          <w:sz w:val="24"/>
+        </w:rPr>
+        <w:t>The service you have chosen includes Swite, the free app that lets you publish and manage your own website from your social media accounts. Activate it from the Control Panel.</w:t>
+      </w:r>
+    </w:p>
+    <w:p>
+      <w:pPr>
+        <w:pStyle w:val="BodyText"/>
+        <w:spacing w:before="200" w:after="120"/>
+        <w:ind w:hanging="0" w:start="0" w:end="0"/>
+        <w:rPr/>
+      </w:pPr>
+      <w:r>
+        <w:rPr/>
+        <w:br/>
+      </w:r>
+      <w:r>
+        <w:br w:type="page"/>
+      </w:r>
+    </w:p>
+    <w:p>
+      <w:pPr>
+        <w:pStyle w:val="Normal"/>
+        <w:bidi w:val="0"/>
+        <w:spacing w:before="200" w:after="120"/>
+        <w:jc w:val="start"/>
+        <w:rPr/>
+      </w:pPr>
+      <w:r>
+        <w:rPr/>
         <w:t>WIX → ARUBA TRANSFER READINESS CHECK (COPY</w:t>
         <w:noBreakHyphen/>
         <w:t>FRIENDLY)</w:t>
@@ -1568,6 +1993,7 @@
     <w:p>
       <w:pPr>
         <w:pStyle w:val="BodyText"/>
+        <w:bidi w:val="0"/>
         <w:spacing w:before="200" w:after="120"/>
         <w:ind w:hanging="0" w:start="0" w:end="0"/>
         <w:rPr/>
@@ -1613,6 +2039,362 @@
         <w:t>Host: @ IP: 185.199.111.153</w:t>
       </w:r>
     </w:p>
+    <w:p>
+      <w:pPr>
+        <w:pStyle w:val="BodyText"/>
+        <w:spacing w:before="200" w:after="120"/>
+        <w:ind w:hanging="0" w:start="0" w:end="0"/>
+        <w:rPr/>
+      </w:pPr>
+      <w:r>
+        <w:rPr/>
+      </w:r>
+    </w:p>
+    <w:tbl>
+      <w:tblPr>
+        <w:tblW w:w="4429" w:type="dxa"/>
+        <w:jc w:val="start"/>
+        <w:tblInd w:w="0" w:type="dxa"/>
+        <w:tblLayout w:type="fixed"/>
+        <w:tblCellMar>
+          <w:top w:w="28" w:type="dxa"/>
+          <w:start w:w="28" w:type="dxa"/>
+          <w:bottom w:w="28" w:type="dxa"/>
+          <w:end w:w="28" w:type="dxa"/>
+        </w:tblCellMar>
+      </w:tblPr>
+      <w:tblGrid>
+        <w:gridCol w:w="987"/>
+        <w:gridCol w:w="705"/>
+        <w:gridCol w:w="2737"/>
+      </w:tblGrid>
+      <w:tr>
+        <w:trPr>
+          <w:tblHeader w:val="true"/>
+        </w:trPr>
+        <w:tc>
+          <w:tcPr>
+            <w:tcW w:w="987" w:type="dxa"/>
+            <w:tcBorders/>
+            <w:vAlign w:val="center"/>
+          </w:tcPr>
+          <w:p>
+            <w:pPr>
+              <w:pStyle w:val="TableHeading"/>
+              <w:rPr/>
+            </w:pPr>
+            <w:r>
+              <w:rPr/>
+              <w:t>Type</w:t>
+            </w:r>
+          </w:p>
+        </w:tc>
+        <w:tc>
+          <w:tcPr>
+            <w:tcW w:w="705" w:type="dxa"/>
+            <w:tcBorders/>
+            <w:vAlign w:val="center"/>
+          </w:tcPr>
+          <w:p>
+            <w:pPr>
+              <w:pStyle w:val="TableHeading"/>
+              <w:rPr/>
+            </w:pPr>
+            <w:r>
+              <w:rPr/>
+              <w:t>Name</w:t>
+            </w:r>
+          </w:p>
+        </w:tc>
+        <w:tc>
+          <w:tcPr>
+            <w:tcW w:w="2737" w:type="dxa"/>
+            <w:tcBorders/>
+            <w:vAlign w:val="center"/>
+          </w:tcPr>
+          <w:p>
+            <w:pPr>
+              <w:pStyle w:val="TableHeading"/>
+              <w:rPr/>
+            </w:pPr>
+            <w:r>
+              <w:rPr/>
+              <w:t>Value</w:t>
+            </w:r>
+          </w:p>
+        </w:tc>
+      </w:tr>
+      <w:tr>
+        <w:trPr/>
+        <w:tc>
+          <w:tcPr>
+            <w:tcW w:w="987" w:type="dxa"/>
+            <w:tcBorders/>
+            <w:vAlign w:val="center"/>
+          </w:tcPr>
+          <w:p>
+            <w:pPr>
+              <w:pStyle w:val="TableContents"/>
+              <w:rPr/>
+            </w:pPr>
+            <w:r>
+              <w:rPr/>
+              <w:t>A</w:t>
+            </w:r>
+          </w:p>
+        </w:tc>
+        <w:tc>
+          <w:tcPr>
+            <w:tcW w:w="705" w:type="dxa"/>
+            <w:tcBorders/>
+            <w:vAlign w:val="center"/>
+          </w:tcPr>
+          <w:p>
+            <w:pPr>
+              <w:pStyle w:val="TableContents"/>
+              <w:rPr/>
+            </w:pPr>
+            <w:r>
+              <w:rPr/>
+              <w:t>@</w:t>
+            </w:r>
+          </w:p>
+        </w:tc>
+        <w:tc>
+          <w:tcPr>
+            <w:tcW w:w="2737" w:type="dxa"/>
+            <w:tcBorders/>
+            <w:vAlign w:val="center"/>
+          </w:tcPr>
+          <w:p>
+            <w:pPr>
+              <w:pStyle w:val="TableContents"/>
+              <w:rPr/>
+            </w:pPr>
+            <w:r>
+              <w:rPr/>
+              <w:t>185.199.108.153</w:t>
+            </w:r>
+          </w:p>
+        </w:tc>
+      </w:tr>
+      <w:tr>
+        <w:trPr/>
+        <w:tc>
+          <w:tcPr>
+            <w:tcW w:w="987" w:type="dxa"/>
+            <w:tcBorders/>
+            <w:vAlign w:val="center"/>
+          </w:tcPr>
+          <w:p>
+            <w:pPr>
+              <w:pStyle w:val="TableContents"/>
+              <w:rPr/>
+            </w:pPr>
+            <w:r>
+              <w:rPr/>
+              <w:t>A</w:t>
+            </w:r>
+          </w:p>
+        </w:tc>
+        <w:tc>
+          <w:tcPr>
+            <w:tcW w:w="705" w:type="dxa"/>
+            <w:tcBorders/>
+            <w:vAlign w:val="center"/>
+          </w:tcPr>
+          <w:p>
+            <w:pPr>
+              <w:pStyle w:val="TableContents"/>
+              <w:rPr/>
+            </w:pPr>
+            <w:r>
+              <w:rPr/>
+              <w:t>@</w:t>
+            </w:r>
+          </w:p>
+        </w:tc>
+        <w:tc>
+          <w:tcPr>
+            <w:tcW w:w="2737" w:type="dxa"/>
+            <w:tcBorders/>
+            <w:vAlign w:val="center"/>
+          </w:tcPr>
+          <w:p>
+            <w:pPr>
+              <w:pStyle w:val="TableContents"/>
+              <w:rPr/>
+            </w:pPr>
+            <w:r>
+              <w:rPr/>
+              <w:t>185.199.109.153</w:t>
+            </w:r>
+          </w:p>
+        </w:tc>
+      </w:tr>
+      <w:tr>
+        <w:trPr/>
+        <w:tc>
+          <w:tcPr>
+            <w:tcW w:w="987" w:type="dxa"/>
+            <w:tcBorders/>
+            <w:vAlign w:val="center"/>
+          </w:tcPr>
+          <w:p>
+            <w:pPr>
+              <w:pStyle w:val="TableContents"/>
+              <w:rPr/>
+            </w:pPr>
+            <w:r>
+              <w:rPr/>
+              <w:t>A</w:t>
+            </w:r>
+          </w:p>
+        </w:tc>
+        <w:tc>
+          <w:tcPr>
+            <w:tcW w:w="705" w:type="dxa"/>
+            <w:tcBorders/>
+            <w:vAlign w:val="center"/>
+          </w:tcPr>
+          <w:p>
+            <w:pPr>
+              <w:pStyle w:val="TableContents"/>
+              <w:rPr/>
+            </w:pPr>
+            <w:r>
+              <w:rPr/>
+              <w:t>@</w:t>
+            </w:r>
+          </w:p>
+        </w:tc>
+        <w:tc>
+          <w:tcPr>
+            <w:tcW w:w="2737" w:type="dxa"/>
+            <w:tcBorders/>
+            <w:vAlign w:val="center"/>
+          </w:tcPr>
+          <w:p>
+            <w:pPr>
+              <w:pStyle w:val="TableContents"/>
+              <w:rPr/>
+            </w:pPr>
+            <w:r>
+              <w:rPr/>
+              <w:t>185.199.110.153</w:t>
+            </w:r>
+          </w:p>
+        </w:tc>
+      </w:tr>
+      <w:tr>
+        <w:trPr/>
+        <w:tc>
+          <w:tcPr>
+            <w:tcW w:w="987" w:type="dxa"/>
+            <w:tcBorders/>
+            <w:vAlign w:val="center"/>
+          </w:tcPr>
+          <w:p>
+            <w:pPr>
+              <w:pStyle w:val="TableContents"/>
+              <w:rPr/>
+            </w:pPr>
+            <w:r>
+              <w:rPr/>
+              <w:t>A</w:t>
+            </w:r>
+          </w:p>
+        </w:tc>
+        <w:tc>
+          <w:tcPr>
+            <w:tcW w:w="705" w:type="dxa"/>
+            <w:tcBorders/>
+            <w:vAlign w:val="center"/>
+          </w:tcPr>
+          <w:p>
+            <w:pPr>
+              <w:pStyle w:val="TableContents"/>
+              <w:rPr/>
+            </w:pPr>
+            <w:r>
+              <w:rPr/>
+              <w:t>@</w:t>
+            </w:r>
+          </w:p>
+        </w:tc>
+        <w:tc>
+          <w:tcPr>
+            <w:tcW w:w="2737" w:type="dxa"/>
+            <w:tcBorders/>
+            <w:vAlign w:val="center"/>
+          </w:tcPr>
+          <w:p>
+            <w:pPr>
+              <w:pStyle w:val="TableContents"/>
+              <w:rPr/>
+            </w:pPr>
+            <w:r>
+              <w:rPr/>
+              <w:t>185.199.111.153</w:t>
+            </w:r>
+          </w:p>
+        </w:tc>
+      </w:tr>
+      <w:tr>
+        <w:trPr/>
+        <w:tc>
+          <w:tcPr>
+            <w:tcW w:w="987" w:type="dxa"/>
+            <w:tcBorders/>
+            <w:vAlign w:val="center"/>
+          </w:tcPr>
+          <w:p>
+            <w:pPr>
+              <w:pStyle w:val="TableContents"/>
+              <w:rPr/>
+            </w:pPr>
+            <w:r>
+              <w:rPr/>
+              <w:t>CNAME</w:t>
+            </w:r>
+          </w:p>
+        </w:tc>
+        <w:tc>
+          <w:tcPr>
+            <w:tcW w:w="705" w:type="dxa"/>
+            <w:tcBorders/>
+            <w:vAlign w:val="center"/>
+          </w:tcPr>
+          <w:p>
+            <w:pPr>
+              <w:pStyle w:val="TableContents"/>
+              <w:rPr/>
+            </w:pPr>
+            <w:r>
+              <w:rPr/>
+              <w:t>www</w:t>
+            </w:r>
+          </w:p>
+        </w:tc>
+        <w:tc>
+          <w:tcPr>
+            <w:tcW w:w="2737" w:type="dxa"/>
+            <w:tcBorders/>
+            <w:vAlign w:val="center"/>
+          </w:tcPr>
+          <w:p>
+            <w:pPr>
+              <w:pStyle w:val="TableContents"/>
+              <w:rPr/>
+            </w:pPr>
+            <w:r>
+              <w:rPr/>
+              <w:t>luigidicastri-hash.github.io</w:t>
+            </w:r>
+          </w:p>
+        </w:tc>
+      </w:tr>
+    </w:tbl>
     <w:p>
       <w:pPr>
         <w:pStyle w:val="BodyText"/>
@@ -1849,7 +2631,7 @@
                     </pic:cNvPicPr>
                   </pic:nvPicPr>
                   <pic:blipFill>
-                    <a:blip r:embed="rId3"/>
+                    <a:blip r:embed="rId5"/>
                     <a:stretch>
                       <a:fillRect/>
                     </a:stretch>
@@ -2216,7 +2998,7 @@
         <w:rPr/>
         <w:t xml:space="preserve">. </w:t>
       </w:r>
-      <w:hyperlink r:id="rId4">
+      <w:hyperlink r:id="rId6">
         <w:r>
           <w:rPr>
             <w:rStyle w:val="Hyperlink"/>
@@ -6190,6 +6972,144 @@
     </w:lvl>
   </w:abstractNum>
   <w:abstractNum w:abstractNumId="24">
+    <w:lvl w:ilvl="0">
+      <w:start w:val="1"/>
+      <w:numFmt w:val="bullet"/>
+      <w:suff w:val="nothing"/>
+      <w:lvlText w:val=""/>
+      <w:lvlJc w:val="start"/>
+      <w:pPr>
+        <w:tabs>
+          <w:tab w:val="num" w:pos="709"/>
+        </w:tabs>
+        <w:ind w:start="709" w:hanging="0"/>
+      </w:pPr>
+      <w:rPr>
+        <w:rFonts w:ascii="Wingdings" w:hAnsi="Wingdings" w:cs="Wingdings" w:hint="default"/>
+      </w:rPr>
+    </w:lvl>
+    <w:lvl w:ilvl="1">
+      <w:start w:val="1"/>
+      <w:numFmt w:val="bullet"/>
+      <w:lvlText w:val=""/>
+      <w:lvlJc w:val="start"/>
+      <w:pPr>
+        <w:tabs>
+          <w:tab w:val="num" w:pos="1418"/>
+        </w:tabs>
+        <w:ind w:start="1418" w:hanging="283"/>
+      </w:pPr>
+      <w:rPr>
+        <w:rFonts w:ascii="Symbol" w:hAnsi="Symbol" w:cs="Symbol" w:hint="default"/>
+      </w:rPr>
+    </w:lvl>
+    <w:lvl w:ilvl="2">
+      <w:start w:val="1"/>
+      <w:numFmt w:val="bullet"/>
+      <w:lvlText w:val=""/>
+      <w:lvlJc w:val="start"/>
+      <w:pPr>
+        <w:tabs>
+          <w:tab w:val="num" w:pos="2127"/>
+        </w:tabs>
+        <w:ind w:start="2127" w:hanging="283"/>
+      </w:pPr>
+      <w:rPr>
+        <w:rFonts w:ascii="Symbol" w:hAnsi="Symbol" w:cs="Symbol" w:hint="default"/>
+      </w:rPr>
+    </w:lvl>
+    <w:lvl w:ilvl="3">
+      <w:start w:val="1"/>
+      <w:numFmt w:val="bullet"/>
+      <w:lvlText w:val=""/>
+      <w:lvlJc w:val="start"/>
+      <w:pPr>
+        <w:tabs>
+          <w:tab w:val="num" w:pos="2836"/>
+        </w:tabs>
+        <w:ind w:start="2836" w:hanging="283"/>
+      </w:pPr>
+      <w:rPr>
+        <w:rFonts w:ascii="Symbol" w:hAnsi="Symbol" w:cs="Symbol" w:hint="default"/>
+      </w:rPr>
+    </w:lvl>
+    <w:lvl w:ilvl="4">
+      <w:start w:val="1"/>
+      <w:numFmt w:val="bullet"/>
+      <w:lvlText w:val=""/>
+      <w:lvlJc w:val="start"/>
+      <w:pPr>
+        <w:tabs>
+          <w:tab w:val="num" w:pos="3545"/>
+        </w:tabs>
+        <w:ind w:start="3545" w:hanging="283"/>
+      </w:pPr>
+      <w:rPr>
+        <w:rFonts w:ascii="Symbol" w:hAnsi="Symbol" w:cs="Symbol" w:hint="default"/>
+      </w:rPr>
+    </w:lvl>
+    <w:lvl w:ilvl="5">
+      <w:start w:val="1"/>
+      <w:numFmt w:val="bullet"/>
+      <w:lvlText w:val=""/>
+      <w:lvlJc w:val="start"/>
+      <w:pPr>
+        <w:tabs>
+          <w:tab w:val="num" w:pos="4254"/>
+        </w:tabs>
+        <w:ind w:start="4254" w:hanging="283"/>
+      </w:pPr>
+      <w:rPr>
+        <w:rFonts w:ascii="Symbol" w:hAnsi="Symbol" w:cs="Symbol" w:hint="default"/>
+      </w:rPr>
+    </w:lvl>
+    <w:lvl w:ilvl="6">
+      <w:start w:val="1"/>
+      <w:numFmt w:val="bullet"/>
+      <w:lvlText w:val=""/>
+      <w:lvlJc w:val="start"/>
+      <w:pPr>
+        <w:tabs>
+          <w:tab w:val="num" w:pos="4963"/>
+        </w:tabs>
+        <w:ind w:start="4963" w:hanging="283"/>
+      </w:pPr>
+      <w:rPr>
+        <w:rFonts w:ascii="Symbol" w:hAnsi="Symbol" w:cs="Symbol" w:hint="default"/>
+      </w:rPr>
+    </w:lvl>
+    <w:lvl w:ilvl="7">
+      <w:start w:val="1"/>
+      <w:numFmt w:val="bullet"/>
+      <w:lvlText w:val=""/>
+      <w:lvlJc w:val="start"/>
+      <w:pPr>
+        <w:tabs>
+          <w:tab w:val="num" w:pos="5672"/>
+        </w:tabs>
+        <w:ind w:start="5672" w:hanging="283"/>
+      </w:pPr>
+      <w:rPr>
+        <w:rFonts w:ascii="Symbol" w:hAnsi="Symbol" w:cs="Symbol" w:hint="default"/>
+      </w:rPr>
+    </w:lvl>
+    <w:lvl w:ilvl="8">
+      <w:start w:val="1"/>
+      <w:numFmt w:val="bullet"/>
+      <w:lvlText w:val=""/>
+      <w:lvlJc w:val="start"/>
+      <w:pPr>
+        <w:tabs>
+          <w:tab w:val="num" w:pos="6381"/>
+        </w:tabs>
+        <w:ind w:start="6381" w:hanging="283"/>
+      </w:pPr>
+      <w:rPr>
+        <w:rFonts w:ascii="Symbol" w:hAnsi="Symbol" w:cs="Symbol" w:hint="default"/>
+      </w:rPr>
+    </w:lvl>
+  </w:abstractNum>
+  <w:abstractNum w:abstractNumId="25">
     <w:lvl w:ilvl="0">
       <w:start w:val="1"/>
       <w:numFmt w:val="none"/>
@@ -6380,6 +7300,9 @@
   <w:num w:numId="24">
     <w:abstractNumId w:val="24"/>
   </w:num>
+  <w:num w:numId="25">
+    <w:abstractNumId w:val="25"/>
+  </w:num>
 </w:numbering>
 </file>
 
@@ -6454,8 +7377,8 @@
       <w:szCs w:val="28"/>
     </w:rPr>
   </w:style>
-  <w:style w:type="character" w:styleId="Bulletsuser">
-    <w:name w:val="Bullets (user)"/>
+  <w:style w:type="character" w:styleId="Bullets">
+    <w:name w:val="Bullets"/>
     <w:qFormat/>
     <w:rPr>
       <w:rFonts w:ascii="OpenSymbol" w:hAnsi="OpenSymbol" w:eastAsia="OpenSymbol" w:cs="OpenSymbol"/>
@@ -6544,6 +7467,29 @@
     </w:pPr>
     <w:rPr>
       <w:rFonts w:cs="Lucida Sans"/>
+    </w:rPr>
+  </w:style>
+  <w:style w:type="paragraph" w:styleId="TableContents">
+    <w:name w:val="Table Contents"/>
+    <w:basedOn w:val="Normal"/>
+    <w:qFormat/>
+    <w:pPr>
+      <w:widowControl w:val="false"/>
+      <w:suppressLineNumbers/>
+    </w:pPr>
+    <w:rPr/>
+  </w:style>
+  <w:style w:type="paragraph" w:styleId="TableHeading">
+    <w:name w:val="Table Heading"/>
+    <w:basedOn w:val="TableContents"/>
+    <w:qFormat/>
+    <w:pPr>
+      <w:suppressLineNumbers/>
+      <w:jc w:val="center"/>
+    </w:pPr>
+    <w:rPr>
+      <w:b/>
+      <w:bCs/>
     </w:rPr>
   </w:style>
 </w:styles>

</xml_diff>